<commit_message>
fix: shaded callout/blockquote lose bar or background; computed row-height leak
</commit_message>
<xml_diff>
--- a/examples/invoice/output.docx
+++ b/examples/invoice/output.docx
@@ -999,12 +999,12 @@
       <w:tblPr>
         <w:tblW w:type="pct" w:w="100%"/>
         <w:tblBorders>
-          <w:top w:val="single" w:color="FFFFFF" w:sz="12"/>
-          <w:left w:val="single" w:color="FFFFFF" w:sz="12"/>
-          <w:bottom w:val="single" w:color="FFFFFF" w:sz="12"/>
-          <w:right w:val="single" w:color="FFFFFF" w:sz="12"/>
-          <w:insideH w:val="single" w:color="FFFFFF" w:sz="12"/>
-          <w:insideV w:val="single" w:color="FFFFFF" w:sz="12"/>
+          <w:top w:val="none" w:color="auto" w:sz="0"/>
+          <w:left w:val="none" w:color="auto" w:sz="0"/>
+          <w:bottom w:val="none" w:color="auto" w:sz="0"/>
+          <w:right w:val="none" w:color="auto" w:sz="0"/>
+          <w:insideH w:val="none" w:color="auto" w:sz="0"/>
+          <w:insideV w:val="none" w:color="auto" w:sz="0"/>
         </w:tblBorders>
         <w:tblLayout w:type="fixed"/>
       </w:tblPr>
@@ -1373,7 +1373,7 @@
         </w:rPr>
         <w:t xml:space="preserve"> </w:t>
       </w:r>
-      <w:hyperlink w:history="1" r:id="rId5bu6k0ubpavbnvpt3vhxs">
+      <w:hyperlink w:history="1" r:id="rIdusmmyuq6smllq8fgyucth">
         <w:r>
           <w:rPr>
             <w:rStyle w:val="Hyperlink"/>

</xml_diff>